<commit_message>
UPDATE step 2 API tables
add he necessary information required in the API step 2
</commit_message>
<xml_diff>
--- a/docs/API Endpoint plan.docx
+++ b/docs/API Endpoint plan.docx
@@ -252,12 +252,12 @@
         <w:tblLook w:val="04A0" w:firstRow="1" w:lastRow="0" w:firstColumn="1" w:lastColumn="0" w:noHBand="0" w:noVBand="1"/>
       </w:tblPr>
       <w:tblGrid>
-        <w:gridCol w:w="2092"/>
-        <w:gridCol w:w="1906"/>
-        <w:gridCol w:w="2246"/>
-        <w:gridCol w:w="2237"/>
-        <w:gridCol w:w="3207"/>
-        <w:gridCol w:w="3621"/>
+        <w:gridCol w:w="1422"/>
+        <w:gridCol w:w="2005"/>
+        <w:gridCol w:w="1891"/>
+        <w:gridCol w:w="1891"/>
+        <w:gridCol w:w="5707"/>
+        <w:gridCol w:w="2393"/>
       </w:tblGrid>
       <w:tr>
         <w:tc>
@@ -352,25 +352,44 @@
           <w:tcPr>
             <w:tcW w:w="2268" w:type="dxa"/>
           </w:tcPr>
-          <w:p/>
+          <w:p>
+            <w:r>
+              <w:t xml:space="preserve">This will return the profile details of the </w:t>
+            </w:r>
+            <w:r>
+              <w:t>recently authenticated user</w:t>
+            </w:r>
+          </w:p>
         </w:tc>
         <w:tc>
           <w:tcPr>
             <w:tcW w:w="2268" w:type="dxa"/>
           </w:tcPr>
-          <w:p/>
+          <w:p>
+            <w:r>
+              <w:t>Any authenticated user</w:t>
+            </w:r>
+          </w:p>
         </w:tc>
         <w:tc>
           <w:tcPr>
             <w:tcW w:w="3265" w:type="dxa"/>
           </w:tcPr>
-          <w:p/>
+          <w:p>
+            <w:r>
+              <w:t>None</w:t>
+            </w:r>
+          </w:p>
         </w:tc>
         <w:tc>
           <w:tcPr>
             <w:tcW w:w="3685" w:type="dxa"/>
           </w:tcPr>
-          <w:p/>
+          <w:p>
+            <w:r>
+              <w:t>200 OK, 401 Unauthorised</w:t>
+            </w:r>
+          </w:p>
         </w:tc>
       </w:tr>
       <w:tr>
@@ -388,31 +407,57 @@
           <w:tcPr>
             <w:tcW w:w="1701" w:type="dxa"/>
           </w:tcPr>
-          <w:p/>
+          <w:p>
+            <w:r>
+              <w:t>/Api/users/profile</w:t>
+            </w:r>
+          </w:p>
         </w:tc>
         <w:tc>
           <w:tcPr>
             <w:tcW w:w="2268" w:type="dxa"/>
           </w:tcPr>
-          <w:p/>
+          <w:p>
+            <w:r>
+              <w:t>Updates the profile details of the recently authenticated user</w:t>
+            </w:r>
+          </w:p>
         </w:tc>
         <w:tc>
           <w:tcPr>
             <w:tcW w:w="2268" w:type="dxa"/>
           </w:tcPr>
-          <w:p/>
+          <w:p>
+            <w:r>
+              <w:t>Any authenticated user</w:t>
+            </w:r>
+          </w:p>
         </w:tc>
         <w:tc>
           <w:tcPr>
             <w:tcW w:w="3265" w:type="dxa"/>
           </w:tcPr>
-          <w:p/>
+          <w:p>
+            <w:r>
+              <w:t>FirstName,LastName,phoneNumber</w:t>
+            </w:r>
+            <w:r>
+              <w:t>,profilePictureRL</w:t>
+            </w:r>
+          </w:p>
         </w:tc>
         <w:tc>
           <w:tcPr>
             <w:tcW w:w="3685" w:type="dxa"/>
           </w:tcPr>
-          <w:p/>
+          <w:p>
+            <w:r>
+              <w:t xml:space="preserve">200 OK,400 Bad Request,401 </w:t>
+            </w:r>
+            <w:r>
+              <w:t>Unauthorized</w:t>
+            </w:r>
+          </w:p>
         </w:tc>
       </w:tr>
     </w:tbl>

</xml_diff>

<commit_message>
Create step 3 table
Create a table with 6 columns and 4 rows
</commit_message>
<xml_diff>
--- a/docs/API Endpoint plan.docx
+++ b/docs/API Endpoint plan.docx
@@ -103,7 +103,15 @@
           </w:tcPr>
           <w:p>
             <w:r>
-              <w:t>/api/auth</w:t>
+              <w:t>/</w:t>
+            </w:r>
+            <w:proofErr w:type="spellStart"/>
+            <w:r>
+              <w:t>api</w:t>
+            </w:r>
+            <w:proofErr w:type="spellEnd"/>
+            <w:r>
+              <w:t>/auth</w:t>
             </w:r>
             <w:r>
               <w:t>/register</w:t>
@@ -116,7 +124,15 @@
           </w:tcPr>
           <w:p>
             <w:r>
-              <w:t>Will register a new raceday user account</w:t>
+              <w:t xml:space="preserve">Will register a new </w:t>
+            </w:r>
+            <w:proofErr w:type="spellStart"/>
+            <w:r>
+              <w:t>raceday</w:t>
+            </w:r>
+            <w:proofErr w:type="spellEnd"/>
+            <w:r>
+              <w:t xml:space="preserve"> user account</w:t>
             </w:r>
           </w:p>
         </w:tc>
@@ -136,7 +152,20 @@
           </w:tcPr>
           <w:p>
             <w:r>
-              <w:t>FirstName, lastName,email,phoneNumber, password, role</w:t>
+              <w:t xml:space="preserve">FirstName, </w:t>
+            </w:r>
+            <w:proofErr w:type="spellStart"/>
+            <w:proofErr w:type="gramStart"/>
+            <w:r>
+              <w:t>lastName,email</w:t>
+            </w:r>
+            <w:proofErr w:type="gramEnd"/>
+            <w:r>
+              <w:t>,phoneNumber</w:t>
+            </w:r>
+            <w:proofErr w:type="spellEnd"/>
+            <w:r>
+              <w:t>, password, role</w:t>
             </w:r>
           </w:p>
         </w:tc>
@@ -177,7 +206,15 @@
           </w:tcPr>
           <w:p>
             <w:r>
-              <w:t>/api/auth/login</w:t>
+              <w:t>/</w:t>
+            </w:r>
+            <w:proofErr w:type="spellStart"/>
+            <w:r>
+              <w:t>api</w:t>
+            </w:r>
+            <w:proofErr w:type="spellEnd"/>
+            <w:r>
+              <w:t>/auth/login</w:t>
             </w:r>
           </w:p>
         </w:tc>
@@ -344,8 +381,21 @@
           </w:tcPr>
           <w:p>
             <w:r>
-              <w:t>/api/usersprofile</w:t>
-            </w:r>
+              <w:t>/</w:t>
+            </w:r>
+            <w:proofErr w:type="spellStart"/>
+            <w:r>
+              <w:t>api</w:t>
+            </w:r>
+            <w:proofErr w:type="spellEnd"/>
+            <w:r>
+              <w:t>/</w:t>
+            </w:r>
+            <w:proofErr w:type="spellStart"/>
+            <w:r>
+              <w:t>usersprofile</w:t>
+            </w:r>
+            <w:proofErr w:type="spellEnd"/>
           </w:p>
         </w:tc>
         <w:tc>
@@ -438,12 +488,24 @@
             <w:tcW w:w="3265" w:type="dxa"/>
           </w:tcPr>
           <w:p>
-            <w:r>
-              <w:t>FirstName,LastName,phoneNumber</w:t>
+            <w:proofErr w:type="spellStart"/>
+            <w:proofErr w:type="gramStart"/>
+            <w:r>
+              <w:t>FirstName,LastName</w:t>
+            </w:r>
+            <w:proofErr w:type="gramEnd"/>
+            <w:r>
+              <w:t>,</w:t>
+            </w:r>
+            <w:proofErr w:type="gramStart"/>
+            <w:r>
+              <w:t>phoneNumber</w:t>
             </w:r>
             <w:r>
               <w:t>,profilePictureRL</w:t>
             </w:r>
+            <w:proofErr w:type="spellEnd"/>
+            <w:proofErr w:type="gramEnd"/>
           </w:p>
         </w:tc>
         <w:tc>
@@ -488,7 +550,7 @@
       <w:tr>
         <w:tc>
           <w:tcPr>
-            <w:tcW w:w="2122" w:type="dxa"/>
+            <w:tcW w:w="1422" w:type="dxa"/>
           </w:tcPr>
           <w:p>
             <w:r>
@@ -498,7 +560,7 @@
         </w:tc>
         <w:tc>
           <w:tcPr>
-            <w:tcW w:w="1701" w:type="dxa"/>
+            <w:tcW w:w="2005" w:type="dxa"/>
           </w:tcPr>
           <w:p>
             <w:r>
@@ -508,7 +570,7 @@
         </w:tc>
         <w:tc>
           <w:tcPr>
-            <w:tcW w:w="2268" w:type="dxa"/>
+            <w:tcW w:w="1891" w:type="dxa"/>
           </w:tcPr>
           <w:p>
             <w:r>
@@ -518,7 +580,7 @@
         </w:tc>
         <w:tc>
           <w:tcPr>
-            <w:tcW w:w="2268" w:type="dxa"/>
+            <w:tcW w:w="1891" w:type="dxa"/>
           </w:tcPr>
           <w:p>
             <w:r>
@@ -528,7 +590,7 @@
         </w:tc>
         <w:tc>
           <w:tcPr>
-            <w:tcW w:w="3265" w:type="dxa"/>
+            <w:tcW w:w="5707" w:type="dxa"/>
           </w:tcPr>
           <w:p>
             <w:r>
@@ -538,7 +600,7 @@
         </w:tc>
         <w:tc>
           <w:tcPr>
-            <w:tcW w:w="3685" w:type="dxa"/>
+            <w:tcW w:w="2393" w:type="dxa"/>
           </w:tcPr>
           <w:p>
             <w:r>
@@ -550,7 +612,7 @@
       <w:tr>
         <w:tc>
           <w:tcPr>
-            <w:tcW w:w="2122" w:type="dxa"/>
+            <w:tcW w:w="1422" w:type="dxa"/>
           </w:tcPr>
           <w:p>
             <w:r>
@@ -560,17 +622,30 @@
         </w:tc>
         <w:tc>
           <w:tcPr>
-            <w:tcW w:w="1701" w:type="dxa"/>
-          </w:tcPr>
-          <w:p>
-            <w:r>
-              <w:t>/api/usersprofile</w:t>
-            </w:r>
-          </w:p>
-        </w:tc>
-        <w:tc>
-          <w:tcPr>
-            <w:tcW w:w="2268" w:type="dxa"/>
+            <w:tcW w:w="2005" w:type="dxa"/>
+          </w:tcPr>
+          <w:p>
+            <w:r>
+              <w:t>/</w:t>
+            </w:r>
+            <w:proofErr w:type="spellStart"/>
+            <w:r>
+              <w:t>api</w:t>
+            </w:r>
+            <w:proofErr w:type="spellEnd"/>
+            <w:r>
+              <w:t>/</w:t>
+            </w:r>
+            <w:proofErr w:type="spellStart"/>
+            <w:r>
+              <w:t>usersprofile</w:t>
+            </w:r>
+            <w:proofErr w:type="spellEnd"/>
+          </w:p>
+        </w:tc>
+        <w:tc>
+          <w:tcPr>
+            <w:tcW w:w="1891" w:type="dxa"/>
           </w:tcPr>
           <w:p>
             <w:r>
@@ -580,7 +655,7 @@
         </w:tc>
         <w:tc>
           <w:tcPr>
-            <w:tcW w:w="2268" w:type="dxa"/>
+            <w:tcW w:w="1891" w:type="dxa"/>
           </w:tcPr>
           <w:p>
             <w:r>
@@ -590,7 +665,7 @@
         </w:tc>
         <w:tc>
           <w:tcPr>
-            <w:tcW w:w="3265" w:type="dxa"/>
+            <w:tcW w:w="5707" w:type="dxa"/>
           </w:tcPr>
           <w:p>
             <w:r>
@@ -600,7 +675,7 @@
         </w:tc>
         <w:tc>
           <w:tcPr>
-            <w:tcW w:w="3685" w:type="dxa"/>
+            <w:tcW w:w="2393" w:type="dxa"/>
           </w:tcPr>
           <w:p>
             <w:r>
@@ -612,7 +687,83 @@
       <w:tr>
         <w:tc>
           <w:tcPr>
-            <w:tcW w:w="2122" w:type="dxa"/>
+            <w:tcW w:w="1422" w:type="dxa"/>
+          </w:tcPr>
+          <w:p/>
+        </w:tc>
+        <w:tc>
+          <w:tcPr>
+            <w:tcW w:w="2005" w:type="dxa"/>
+          </w:tcPr>
+          <w:p/>
+        </w:tc>
+        <w:tc>
+          <w:tcPr>
+            <w:tcW w:w="1891" w:type="dxa"/>
+          </w:tcPr>
+          <w:p/>
+        </w:tc>
+        <w:tc>
+          <w:tcPr>
+            <w:tcW w:w="1891" w:type="dxa"/>
+          </w:tcPr>
+          <w:p/>
+        </w:tc>
+        <w:tc>
+          <w:tcPr>
+            <w:tcW w:w="5707" w:type="dxa"/>
+          </w:tcPr>
+          <w:p/>
+        </w:tc>
+        <w:tc>
+          <w:tcPr>
+            <w:tcW w:w="2393" w:type="dxa"/>
+          </w:tcPr>
+          <w:p/>
+        </w:tc>
+      </w:tr>
+      <w:tr>
+        <w:tc>
+          <w:tcPr>
+            <w:tcW w:w="1422" w:type="dxa"/>
+          </w:tcPr>
+          <w:p/>
+        </w:tc>
+        <w:tc>
+          <w:tcPr>
+            <w:tcW w:w="2005" w:type="dxa"/>
+          </w:tcPr>
+          <w:p/>
+        </w:tc>
+        <w:tc>
+          <w:tcPr>
+            <w:tcW w:w="1891" w:type="dxa"/>
+          </w:tcPr>
+          <w:p/>
+        </w:tc>
+        <w:tc>
+          <w:tcPr>
+            <w:tcW w:w="1891" w:type="dxa"/>
+          </w:tcPr>
+          <w:p/>
+        </w:tc>
+        <w:tc>
+          <w:tcPr>
+            <w:tcW w:w="5707" w:type="dxa"/>
+          </w:tcPr>
+          <w:p/>
+        </w:tc>
+        <w:tc>
+          <w:tcPr>
+            <w:tcW w:w="2393" w:type="dxa"/>
+          </w:tcPr>
+          <w:p/>
+        </w:tc>
+      </w:tr>
+      <w:tr>
+        <w:tc>
+          <w:tcPr>
+            <w:tcW w:w="1422" w:type="dxa"/>
           </w:tcPr>
           <w:p>
             <w:r>
@@ -622,7 +773,7 @@
         </w:tc>
         <w:tc>
           <w:tcPr>
-            <w:tcW w:w="1701" w:type="dxa"/>
+            <w:tcW w:w="2005" w:type="dxa"/>
           </w:tcPr>
           <w:p>
             <w:r>
@@ -632,7 +783,7 @@
         </w:tc>
         <w:tc>
           <w:tcPr>
-            <w:tcW w:w="2268" w:type="dxa"/>
+            <w:tcW w:w="1891" w:type="dxa"/>
           </w:tcPr>
           <w:p>
             <w:r>
@@ -642,7 +793,7 @@
         </w:tc>
         <w:tc>
           <w:tcPr>
-            <w:tcW w:w="2268" w:type="dxa"/>
+            <w:tcW w:w="1891" w:type="dxa"/>
           </w:tcPr>
           <w:p>
             <w:r>
@@ -652,17 +803,13 @@
         </w:tc>
         <w:tc>
           <w:tcPr>
-            <w:tcW w:w="3265" w:type="dxa"/>
-          </w:tcPr>
-          <w:p>
-            <w:r>
-              <w:t>FirstName,LastName,phoneNumber,profilePictureRL</w:t>
-            </w:r>
-          </w:p>
-        </w:tc>
-        <w:tc>
-          <w:tcPr>
-            <w:tcW w:w="3685" w:type="dxa"/>
+            <w:tcW w:w="5707" w:type="dxa"/>
+          </w:tcPr>
+          <w:p/>
+        </w:tc>
+        <w:tc>
+          <w:tcPr>
+            <w:tcW w:w="2393" w:type="dxa"/>
           </w:tcPr>
           <w:p>
             <w:r>

</xml_diff>

<commit_message>
Correcrt information in step 3
</commit_message>
<xml_diff>
--- a/docs/API Endpoint plan.docx
+++ b/docs/API Endpoint plan.docx
@@ -644,7 +644,13 @@
           </w:tcPr>
           <w:p>
             <w:r>
-              <w:t>/api/event/{id}</w:t>
+              <w:t>/api/event</w:t>
+            </w:r>
+            <w:r>
+              <w:t>s</w:t>
+            </w:r>
+            <w:r>
+              <w:t>/{id}</w:t>
             </w:r>
           </w:p>
         </w:tc>
@@ -823,7 +829,22 @@
           </w:tcPr>
           <w:p>
             <w:r>
-              <w:t>201 Created,400 Bad Reqquest,401 Unauthorized,403 Forbidden</w:t>
+              <w:t>2</w:t>
+            </w:r>
+            <w:r>
+              <w:t>0</w:t>
+            </w:r>
+            <w:r>
+              <w:t>0</w:t>
+            </w:r>
+            <w:r>
+              <w:t xml:space="preserve"> </w:t>
+            </w:r>
+            <w:r>
+              <w:t>OK</w:t>
+            </w:r>
+            <w:r>
+              <w:t>,400 Bad Reqquest,401 Unauthorized,403 Forbidden</w:t>
             </w:r>
             <w:r>
               <w:t>,404 Not Found</w:t>

</xml_diff>

<commit_message>
Create step 4 Table
Create step 4 table and add the necessary heading in each heading
</commit_message>
<xml_diff>
--- a/docs/API Endpoint plan.docx
+++ b/docs/API Endpoint plan.docx
@@ -103,7 +103,15 @@
           </w:tcPr>
           <w:p>
             <w:r>
-              <w:t>/api/auth</w:t>
+              <w:t>/</w:t>
+            </w:r>
+            <w:proofErr w:type="spellStart"/>
+            <w:r>
+              <w:t>api</w:t>
+            </w:r>
+            <w:proofErr w:type="spellEnd"/>
+            <w:r>
+              <w:t>/auth</w:t>
             </w:r>
             <w:r>
               <w:t>/register</w:t>
@@ -119,7 +127,15 @@
               <w:t>R</w:t>
             </w:r>
             <w:r>
-              <w:t>egister a new raceday user account</w:t>
+              <w:t xml:space="preserve">egister a new </w:t>
+            </w:r>
+            <w:proofErr w:type="spellStart"/>
+            <w:r>
+              <w:t>raceday</w:t>
+            </w:r>
+            <w:proofErr w:type="spellEnd"/>
+            <w:r>
+              <w:t xml:space="preserve"> user account</w:t>
             </w:r>
           </w:p>
         </w:tc>
@@ -139,7 +155,20 @@
           </w:tcPr>
           <w:p>
             <w:r>
-              <w:t>FirstName, lastName,email,phoneNumber, password, role</w:t>
+              <w:t xml:space="preserve">FirstName, </w:t>
+            </w:r>
+            <w:proofErr w:type="spellStart"/>
+            <w:proofErr w:type="gramStart"/>
+            <w:r>
+              <w:t>lastName,email</w:t>
+            </w:r>
+            <w:proofErr w:type="gramEnd"/>
+            <w:r>
+              <w:t>,phoneNumber</w:t>
+            </w:r>
+            <w:proofErr w:type="spellEnd"/>
+            <w:r>
+              <w:t>, password, role</w:t>
             </w:r>
           </w:p>
         </w:tc>
@@ -180,7 +209,15 @@
           </w:tcPr>
           <w:p>
             <w:r>
-              <w:t>/api/auth/login</w:t>
+              <w:t>/</w:t>
+            </w:r>
+            <w:proofErr w:type="spellStart"/>
+            <w:r>
+              <w:t>api</w:t>
+            </w:r>
+            <w:proofErr w:type="spellEnd"/>
+            <w:r>
+              <w:t>/auth/login</w:t>
             </w:r>
           </w:p>
         </w:tc>
@@ -353,8 +390,21 @@
           </w:tcPr>
           <w:p>
             <w:r>
-              <w:t>/api/usersprofile</w:t>
-            </w:r>
+              <w:t>/</w:t>
+            </w:r>
+            <w:proofErr w:type="spellStart"/>
+            <w:r>
+              <w:t>api</w:t>
+            </w:r>
+            <w:proofErr w:type="spellEnd"/>
+            <w:r>
+              <w:t>/</w:t>
+            </w:r>
+            <w:proofErr w:type="spellStart"/>
+            <w:r>
+              <w:t>usersprofile</w:t>
+            </w:r>
+            <w:proofErr w:type="spellEnd"/>
           </w:p>
         </w:tc>
         <w:tc>
@@ -450,12 +500,24 @@
             <w:tcW w:w="3265" w:type="dxa"/>
           </w:tcPr>
           <w:p>
-            <w:r>
-              <w:t>FirstName,LastName,phoneNumber</w:t>
+            <w:proofErr w:type="spellStart"/>
+            <w:proofErr w:type="gramStart"/>
+            <w:r>
+              <w:t>FirstName,LastName</w:t>
+            </w:r>
+            <w:proofErr w:type="gramEnd"/>
+            <w:r>
+              <w:t>,</w:t>
+            </w:r>
+            <w:proofErr w:type="gramStart"/>
+            <w:r>
+              <w:t>phoneNumber</w:t>
             </w:r>
             <w:r>
               <w:t>,profilePictureRL</w:t>
             </w:r>
+            <w:proofErr w:type="spellEnd"/>
+            <w:proofErr w:type="gramEnd"/>
           </w:p>
         </w:tc>
         <w:tc>
@@ -579,7 +641,15 @@
           </w:tcPr>
           <w:p>
             <w:r>
-              <w:t>/api/</w:t>
+              <w:t>/</w:t>
+            </w:r>
+            <w:proofErr w:type="spellStart"/>
+            <w:r>
+              <w:t>api</w:t>
+            </w:r>
+            <w:proofErr w:type="spellEnd"/>
+            <w:r>
+              <w:t>/</w:t>
             </w:r>
             <w:r>
               <w:t>events</w:t>
@@ -592,7 +662,15 @@
           </w:tcPr>
           <w:p>
             <w:r>
-              <w:t>will return all the available RaceDay Events</w:t>
+              <w:t xml:space="preserve">will return all the available </w:t>
+            </w:r>
+            <w:proofErr w:type="spellStart"/>
+            <w:r>
+              <w:t>RaceDay</w:t>
+            </w:r>
+            <w:proofErr w:type="spellEnd"/>
+            <w:r>
+              <w:t xml:space="preserve"> Events</w:t>
             </w:r>
           </w:p>
         </w:tc>
@@ -644,7 +722,17 @@
           </w:tcPr>
           <w:p>
             <w:r>
-              <w:t>/api/event</w:t>
+              <w:t>/</w:t>
+            </w:r>
+            <w:proofErr w:type="spellStart"/>
+            <w:proofErr w:type="gramStart"/>
+            <w:r>
+              <w:t>api</w:t>
+            </w:r>
+            <w:proofErr w:type="spellEnd"/>
+            <w:proofErr w:type="gramEnd"/>
+            <w:r>
+              <w:t>/event</w:t>
             </w:r>
             <w:r>
               <w:t>s</w:t>
@@ -715,7 +803,15 @@
           </w:tcPr>
           <w:p>
             <w:r>
-              <w:t>/api/events</w:t>
+              <w:t>/</w:t>
+            </w:r>
+            <w:proofErr w:type="spellStart"/>
+            <w:r>
+              <w:t>api</w:t>
+            </w:r>
+            <w:proofErr w:type="spellEnd"/>
+            <w:r>
+              <w:t>/events</w:t>
             </w:r>
           </w:p>
         </w:tc>
@@ -728,7 +824,15 @@
               <w:t>Create a</w:t>
             </w:r>
             <w:r>
-              <w:t xml:space="preserve"> new RaceDay event</w:t>
+              <w:t xml:space="preserve"> new </w:t>
+            </w:r>
+            <w:proofErr w:type="spellStart"/>
+            <w:r>
+              <w:t>RaceDay</w:t>
+            </w:r>
+            <w:proofErr w:type="spellEnd"/>
+            <w:r>
+              <w:t xml:space="preserve"> event</w:t>
             </w:r>
           </w:p>
         </w:tc>
@@ -748,10 +852,44 @@
           </w:tcPr>
           <w:p>
             <w:r>
-              <w:t>{eventName, description.eventDate, location, distance</w:t>
-            </w:r>
-            <w:r>
-              <w:t>, eventTypeID, bannerImageURL}</w:t>
+              <w:t>{</w:t>
+            </w:r>
+            <w:proofErr w:type="spellStart"/>
+            <w:r>
+              <w:t>eventName</w:t>
+            </w:r>
+            <w:proofErr w:type="spellEnd"/>
+            <w:r>
+              <w:t xml:space="preserve">, </w:t>
+            </w:r>
+            <w:proofErr w:type="spellStart"/>
+            <w:proofErr w:type="gramStart"/>
+            <w:r>
+              <w:t>description.eventDate</w:t>
+            </w:r>
+            <w:proofErr w:type="spellEnd"/>
+            <w:proofErr w:type="gramEnd"/>
+            <w:r>
+              <w:t>, location, distance</w:t>
+            </w:r>
+            <w:r>
+              <w:t xml:space="preserve">, </w:t>
+            </w:r>
+            <w:proofErr w:type="spellStart"/>
+            <w:r>
+              <w:t>eventTypeID</w:t>
+            </w:r>
+            <w:proofErr w:type="spellEnd"/>
+            <w:r>
+              <w:t xml:space="preserve">, </w:t>
+            </w:r>
+            <w:proofErr w:type="spellStart"/>
+            <w:r>
+              <w:t>bannerImageURL</w:t>
+            </w:r>
+            <w:proofErr w:type="spellEnd"/>
+            <w:r>
+              <w:t>}</w:t>
             </w:r>
           </w:p>
         </w:tc>
@@ -786,7 +924,17 @@
           </w:tcPr>
           <w:p>
             <w:r>
-              <w:t>/api/events/{id}</w:t>
+              <w:t>/</w:t>
+            </w:r>
+            <w:proofErr w:type="spellStart"/>
+            <w:proofErr w:type="gramStart"/>
+            <w:r>
+              <w:t>api</w:t>
+            </w:r>
+            <w:proofErr w:type="spellEnd"/>
+            <w:proofErr w:type="gramEnd"/>
+            <w:r>
+              <w:t>/events/{id}</w:t>
             </w:r>
           </w:p>
         </w:tc>
@@ -796,7 +944,15 @@
           </w:tcPr>
           <w:p>
             <w:r>
-              <w:t>Updates an existing RaceDay event</w:t>
+              <w:t xml:space="preserve">Updates an existing </w:t>
+            </w:r>
+            <w:proofErr w:type="spellStart"/>
+            <w:r>
+              <w:t>RaceDay</w:t>
+            </w:r>
+            <w:proofErr w:type="spellEnd"/>
+            <w:r>
+              <w:t xml:space="preserve"> event</w:t>
             </w:r>
           </w:p>
         </w:tc>
@@ -815,11 +971,44 @@
             <w:tcW w:w="5707" w:type="dxa"/>
           </w:tcPr>
           <w:p>
+            <w:proofErr w:type="gramStart"/>
             <w:r>
               <w:t xml:space="preserve">{ </w:t>
             </w:r>
-            <w:r>
-              <w:t>eventName, description.eventDate, location, distance, eventTypeID, bannerImageURL}</w:t>
+            <w:proofErr w:type="spellStart"/>
+            <w:r>
+              <w:t>eventName</w:t>
+            </w:r>
+            <w:proofErr w:type="spellEnd"/>
+            <w:proofErr w:type="gramEnd"/>
+            <w:r>
+              <w:t xml:space="preserve">, </w:t>
+            </w:r>
+            <w:proofErr w:type="spellStart"/>
+            <w:proofErr w:type="gramStart"/>
+            <w:r>
+              <w:t>description.eventDate</w:t>
+            </w:r>
+            <w:proofErr w:type="spellEnd"/>
+            <w:proofErr w:type="gramEnd"/>
+            <w:r>
+              <w:t xml:space="preserve">, location, distance, </w:t>
+            </w:r>
+            <w:proofErr w:type="spellStart"/>
+            <w:r>
+              <w:t>eventTypeID</w:t>
+            </w:r>
+            <w:proofErr w:type="spellEnd"/>
+            <w:r>
+              <w:t xml:space="preserve">, </w:t>
+            </w:r>
+            <w:proofErr w:type="spellStart"/>
+            <w:r>
+              <w:t>bannerImageURL</w:t>
+            </w:r>
+            <w:proofErr w:type="spellEnd"/>
+            <w:r>
+              <w:t>}</w:t>
             </w:r>
           </w:p>
         </w:tc>
@@ -871,11 +1060,18 @@
             <w:r>
               <w:t>/</w:t>
             </w:r>
+            <w:proofErr w:type="spellStart"/>
+            <w:proofErr w:type="gramStart"/>
             <w:r>
               <w:t>a</w:t>
             </w:r>
             <w:r>
-              <w:t>pi/</w:t>
+              <w:t>pi</w:t>
+            </w:r>
+            <w:proofErr w:type="spellEnd"/>
+            <w:proofErr w:type="gramEnd"/>
+            <w:r>
+              <w:t>/</w:t>
             </w:r>
             <w:r>
               <w:t>events</w:t>
@@ -894,7 +1090,15 @@
           </w:tcPr>
           <w:p>
             <w:r>
-              <w:t>Deletes an existing RaceDay event</w:t>
+              <w:t xml:space="preserve">Deletes an existing </w:t>
+            </w:r>
+            <w:proofErr w:type="spellStart"/>
+            <w:r>
+              <w:t>RaceDay</w:t>
+            </w:r>
+            <w:proofErr w:type="spellEnd"/>
+            <w:r>
+              <w:t xml:space="preserve"> event</w:t>
             </w:r>
           </w:p>
         </w:tc>
@@ -940,9 +1144,473 @@
     <w:p/>
     <w:p>
       <w:r>
-        <w:t>Step 4 - Categories</w:t>
+        <w:t xml:space="preserve">Step 4 </w:t>
+      </w:r>
+      <w:r>
+        <w:t>–</w:t>
+      </w:r>
+      <w:r>
+        <w:t xml:space="preserve"> Categories</w:t>
       </w:r>
     </w:p>
+    <w:tbl>
+      <w:tblPr>
+        <w:tblStyle w:val="TableGrid"/>
+        <w:tblW w:w="15309" w:type="dxa"/>
+        <w:tblInd w:w="-5" w:type="dxa"/>
+        <w:tblLook w:val="04A0" w:firstRow="1" w:lastRow="0" w:firstColumn="1" w:lastColumn="0" w:noHBand="0" w:noVBand="1"/>
+      </w:tblPr>
+      <w:tblGrid>
+        <w:gridCol w:w="1422"/>
+        <w:gridCol w:w="2005"/>
+        <w:gridCol w:w="1891"/>
+        <w:gridCol w:w="1891"/>
+        <w:gridCol w:w="5707"/>
+        <w:gridCol w:w="2393"/>
+      </w:tblGrid>
+      <w:tr>
+        <w:tc>
+          <w:tcPr>
+            <w:tcW w:w="1422" w:type="dxa"/>
+          </w:tcPr>
+          <w:p>
+            <w:r>
+              <w:lastRenderedPageBreak/>
+              <w:t>Http Method</w:t>
+            </w:r>
+          </w:p>
+        </w:tc>
+        <w:tc>
+          <w:tcPr>
+            <w:tcW w:w="2005" w:type="dxa"/>
+          </w:tcPr>
+          <w:p>
+            <w:r>
+              <w:t>Route</w:t>
+            </w:r>
+          </w:p>
+        </w:tc>
+        <w:tc>
+          <w:tcPr>
+            <w:tcW w:w="1891" w:type="dxa"/>
+          </w:tcPr>
+          <w:p>
+            <w:r>
+              <w:t>Description</w:t>
+            </w:r>
+          </w:p>
+        </w:tc>
+        <w:tc>
+          <w:tcPr>
+            <w:tcW w:w="1891" w:type="dxa"/>
+          </w:tcPr>
+          <w:p>
+            <w:r>
+              <w:t>Role required</w:t>
+            </w:r>
+          </w:p>
+        </w:tc>
+        <w:tc>
+          <w:tcPr>
+            <w:tcW w:w="5707" w:type="dxa"/>
+          </w:tcPr>
+          <w:p>
+            <w:r>
+              <w:t>Request Body</w:t>
+            </w:r>
+          </w:p>
+        </w:tc>
+        <w:tc>
+          <w:tcPr>
+            <w:tcW w:w="2393" w:type="dxa"/>
+          </w:tcPr>
+          <w:p>
+            <w:r>
+              <w:t xml:space="preserve">Expected Response </w:t>
+            </w:r>
+          </w:p>
+        </w:tc>
+      </w:tr>
+      <w:tr>
+        <w:tc>
+          <w:tcPr>
+            <w:tcW w:w="1422" w:type="dxa"/>
+          </w:tcPr>
+          <w:p>
+            <w:r>
+              <w:t>GET</w:t>
+            </w:r>
+          </w:p>
+        </w:tc>
+        <w:tc>
+          <w:tcPr>
+            <w:tcW w:w="2005" w:type="dxa"/>
+          </w:tcPr>
+          <w:p>
+            <w:r>
+              <w:t>/</w:t>
+            </w:r>
+            <w:proofErr w:type="spellStart"/>
+            <w:r>
+              <w:t>api</w:t>
+            </w:r>
+            <w:proofErr w:type="spellEnd"/>
+            <w:r>
+              <w:t>/events</w:t>
+            </w:r>
+          </w:p>
+        </w:tc>
+        <w:tc>
+          <w:tcPr>
+            <w:tcW w:w="1891" w:type="dxa"/>
+          </w:tcPr>
+          <w:p>
+            <w:r>
+              <w:t xml:space="preserve">will return all the available </w:t>
+            </w:r>
+            <w:proofErr w:type="spellStart"/>
+            <w:r>
+              <w:t>RaceDay</w:t>
+            </w:r>
+            <w:proofErr w:type="spellEnd"/>
+            <w:r>
+              <w:t xml:space="preserve"> Events</w:t>
+            </w:r>
+          </w:p>
+        </w:tc>
+        <w:tc>
+          <w:tcPr>
+            <w:tcW w:w="1891" w:type="dxa"/>
+          </w:tcPr>
+          <w:p>
+            <w:r>
+              <w:t>Public</w:t>
+            </w:r>
+          </w:p>
+        </w:tc>
+        <w:tc>
+          <w:tcPr>
+            <w:tcW w:w="5707" w:type="dxa"/>
+          </w:tcPr>
+          <w:p>
+            <w:r>
+              <w:t>None</w:t>
+            </w:r>
+          </w:p>
+        </w:tc>
+        <w:tc>
+          <w:tcPr>
+            <w:tcW w:w="2393" w:type="dxa"/>
+          </w:tcPr>
+          <w:p>
+            <w:r>
+              <w:t>200 OK</w:t>
+            </w:r>
+          </w:p>
+        </w:tc>
+      </w:tr>
+      <w:tr>
+        <w:tc>
+          <w:tcPr>
+            <w:tcW w:w="1422" w:type="dxa"/>
+          </w:tcPr>
+          <w:p>
+            <w:r>
+              <w:t>GET</w:t>
+            </w:r>
+          </w:p>
+        </w:tc>
+        <w:tc>
+          <w:tcPr>
+            <w:tcW w:w="2005" w:type="dxa"/>
+          </w:tcPr>
+          <w:p>
+            <w:r>
+              <w:t>/</w:t>
+            </w:r>
+            <w:proofErr w:type="spellStart"/>
+            <w:proofErr w:type="gramStart"/>
+            <w:r>
+              <w:t>api</w:t>
+            </w:r>
+            <w:proofErr w:type="spellEnd"/>
+            <w:proofErr w:type="gramEnd"/>
+            <w:r>
+              <w:t>/events/{id}</w:t>
+            </w:r>
+          </w:p>
+        </w:tc>
+        <w:tc>
+          <w:tcPr>
+            <w:tcW w:w="1891" w:type="dxa"/>
+          </w:tcPr>
+          <w:p>
+            <w:r>
+              <w:t>Returns the details of a specific event using the given event ID</w:t>
+            </w:r>
+          </w:p>
+        </w:tc>
+        <w:tc>
+          <w:tcPr>
+            <w:tcW w:w="1891" w:type="dxa"/>
+          </w:tcPr>
+          <w:p>
+            <w:r>
+              <w:t>Public</w:t>
+            </w:r>
+          </w:p>
+        </w:tc>
+        <w:tc>
+          <w:tcPr>
+            <w:tcW w:w="5707" w:type="dxa"/>
+          </w:tcPr>
+          <w:p>
+            <w:r>
+              <w:t>None</w:t>
+            </w:r>
+          </w:p>
+        </w:tc>
+        <w:tc>
+          <w:tcPr>
+            <w:tcW w:w="2393" w:type="dxa"/>
+          </w:tcPr>
+          <w:p>
+            <w:r>
+              <w:t>200 OK,404 Not Found</w:t>
+            </w:r>
+          </w:p>
+        </w:tc>
+      </w:tr>
+      <w:tr>
+        <w:tc>
+          <w:tcPr>
+            <w:tcW w:w="1422" w:type="dxa"/>
+          </w:tcPr>
+          <w:p>
+            <w:r>
+              <w:t>POST</w:t>
+            </w:r>
+          </w:p>
+        </w:tc>
+        <w:tc>
+          <w:tcPr>
+            <w:tcW w:w="2005" w:type="dxa"/>
+          </w:tcPr>
+          <w:p>
+            <w:r>
+              <w:t>/</w:t>
+            </w:r>
+            <w:proofErr w:type="spellStart"/>
+            <w:r>
+              <w:t>api</w:t>
+            </w:r>
+            <w:proofErr w:type="spellEnd"/>
+            <w:r>
+              <w:t>/events</w:t>
+            </w:r>
+          </w:p>
+        </w:tc>
+        <w:tc>
+          <w:tcPr>
+            <w:tcW w:w="1891" w:type="dxa"/>
+          </w:tcPr>
+          <w:p>
+            <w:r>
+              <w:t xml:space="preserve">Create a new </w:t>
+            </w:r>
+            <w:proofErr w:type="spellStart"/>
+            <w:r>
+              <w:t>RaceDay</w:t>
+            </w:r>
+            <w:proofErr w:type="spellEnd"/>
+            <w:r>
+              <w:t xml:space="preserve"> event</w:t>
+            </w:r>
+          </w:p>
+        </w:tc>
+        <w:tc>
+          <w:tcPr>
+            <w:tcW w:w="1891" w:type="dxa"/>
+          </w:tcPr>
+          <w:p>
+            <w:r>
+              <w:t>Organiser</w:t>
+            </w:r>
+          </w:p>
+        </w:tc>
+        <w:tc>
+          <w:tcPr>
+            <w:tcW w:w="5707" w:type="dxa"/>
+          </w:tcPr>
+          <w:p>
+            <w:r>
+              <w:t>{</w:t>
+            </w:r>
+            <w:proofErr w:type="spellStart"/>
+            <w:r>
+              <w:t>eventName</w:t>
+            </w:r>
+            <w:proofErr w:type="spellEnd"/>
+            <w:r>
+              <w:t xml:space="preserve">, </w:t>
+            </w:r>
+            <w:proofErr w:type="spellStart"/>
+            <w:proofErr w:type="gramStart"/>
+            <w:r>
+              <w:t>description.eventDate</w:t>
+            </w:r>
+            <w:proofErr w:type="spellEnd"/>
+            <w:proofErr w:type="gramEnd"/>
+            <w:r>
+              <w:t xml:space="preserve">, location, distance, </w:t>
+            </w:r>
+            <w:proofErr w:type="spellStart"/>
+            <w:r>
+              <w:t>eventTypeID</w:t>
+            </w:r>
+            <w:proofErr w:type="spellEnd"/>
+            <w:r>
+              <w:t xml:space="preserve">, </w:t>
+            </w:r>
+            <w:proofErr w:type="spellStart"/>
+            <w:r>
+              <w:t>bannerImageURL</w:t>
+            </w:r>
+            <w:proofErr w:type="spellEnd"/>
+            <w:r>
+              <w:t>}</w:t>
+            </w:r>
+          </w:p>
+        </w:tc>
+        <w:tc>
+          <w:tcPr>
+            <w:tcW w:w="2393" w:type="dxa"/>
+          </w:tcPr>
+          <w:p>
+            <w:r>
+              <w:t>201 Created,400 Bad Reqquest,401 Unauthorized,403 Forbidden</w:t>
+            </w:r>
+          </w:p>
+        </w:tc>
+      </w:tr>
+      <w:tr>
+        <w:tc>
+          <w:tcPr>
+            <w:tcW w:w="1422" w:type="dxa"/>
+          </w:tcPr>
+          <w:p>
+            <w:r>
+              <w:t>PUT</w:t>
+            </w:r>
+          </w:p>
+        </w:tc>
+        <w:tc>
+          <w:tcPr>
+            <w:tcW w:w="2005" w:type="dxa"/>
+          </w:tcPr>
+          <w:p>
+            <w:r>
+              <w:t>/</w:t>
+            </w:r>
+            <w:proofErr w:type="spellStart"/>
+            <w:proofErr w:type="gramStart"/>
+            <w:r>
+              <w:t>api</w:t>
+            </w:r>
+            <w:proofErr w:type="spellEnd"/>
+            <w:proofErr w:type="gramEnd"/>
+            <w:r>
+              <w:t>/events/{id}</w:t>
+            </w:r>
+          </w:p>
+        </w:tc>
+        <w:tc>
+          <w:tcPr>
+            <w:tcW w:w="1891" w:type="dxa"/>
+          </w:tcPr>
+          <w:p>
+            <w:r>
+              <w:t xml:space="preserve">Updates an existing </w:t>
+            </w:r>
+            <w:proofErr w:type="spellStart"/>
+            <w:r>
+              <w:t>RaceDay</w:t>
+            </w:r>
+            <w:proofErr w:type="spellEnd"/>
+            <w:r>
+              <w:t xml:space="preserve"> event</w:t>
+            </w:r>
+          </w:p>
+        </w:tc>
+        <w:tc>
+          <w:tcPr>
+            <w:tcW w:w="1891" w:type="dxa"/>
+          </w:tcPr>
+          <w:p>
+            <w:r>
+              <w:t>Organiser</w:t>
+            </w:r>
+          </w:p>
+        </w:tc>
+        <w:tc>
+          <w:tcPr>
+            <w:tcW w:w="5707" w:type="dxa"/>
+          </w:tcPr>
+          <w:p>
+            <w:proofErr w:type="gramStart"/>
+            <w:r>
+              <w:t xml:space="preserve">{ </w:t>
+            </w:r>
+            <w:proofErr w:type="spellStart"/>
+            <w:r>
+              <w:t>eventName</w:t>
+            </w:r>
+            <w:proofErr w:type="spellEnd"/>
+            <w:proofErr w:type="gramEnd"/>
+            <w:r>
+              <w:t xml:space="preserve">, </w:t>
+            </w:r>
+            <w:proofErr w:type="spellStart"/>
+            <w:proofErr w:type="gramStart"/>
+            <w:r>
+              <w:t>description.eventDate</w:t>
+            </w:r>
+            <w:proofErr w:type="spellEnd"/>
+            <w:proofErr w:type="gramEnd"/>
+            <w:r>
+              <w:t xml:space="preserve">, location, distance, </w:t>
+            </w:r>
+            <w:proofErr w:type="spellStart"/>
+            <w:r>
+              <w:t>eventTypeID</w:t>
+            </w:r>
+            <w:proofErr w:type="spellEnd"/>
+            <w:r>
+              <w:t xml:space="preserve">, </w:t>
+            </w:r>
+            <w:proofErr w:type="spellStart"/>
+            <w:r>
+              <w:t>bannerImageURL</w:t>
+            </w:r>
+            <w:proofErr w:type="spellEnd"/>
+            <w:r>
+              <w:t>}</w:t>
+            </w:r>
+          </w:p>
+        </w:tc>
+        <w:tc>
+          <w:tcPr>
+            <w:tcW w:w="2393" w:type="dxa"/>
+          </w:tcPr>
+          <w:p>
+            <w:r>
+              <w:t>200 OK,400 Bad Reqquest,401 Unauthorized,403 Forbidden,404 Not Found</w:t>
+            </w:r>
+          </w:p>
+        </w:tc>
+      </w:tr>
+    </w:tbl>
+    <w:p/>
     <w:sectPr>
       <w:pgSz w:w="16838" w:h="11906" w:orient="landscape"/>
       <w:pgMar w:top="1440" w:right="1440" w:bottom="1440" w:left="1440" w:header="708" w:footer="708" w:gutter="0"/>
@@ -1353,7 +2021,7 @@
   <w:style w:type="paragraph" w:default="1" w:styleId="Normal">
     <w:name w:val="Normal"/>
     <w:qFormat/>
-    <w:rsid w:val="00D36BD3"/>
+    <w:rsid w:val="00034699"/>
   </w:style>
   <w:style w:type="paragraph" w:styleId="Heading1">
     <w:name w:val="heading 1"/>

</xml_diff>

<commit_message>
STEP 5 Grammar correction
I had made a mistake with my request body
</commit_message>
<xml_diff>
--- a/docs/API Endpoint plan.docx
+++ b/docs/API Endpoint plan.docx
@@ -103,15 +103,7 @@
           </w:tcPr>
           <w:p>
             <w:r>
-              <w:t>/</w:t>
-            </w:r>
-            <w:proofErr w:type="spellStart"/>
-            <w:r>
-              <w:t>api</w:t>
-            </w:r>
-            <w:proofErr w:type="spellEnd"/>
-            <w:r>
-              <w:t>/auth</w:t>
+              <w:t>/api/auth</w:t>
             </w:r>
             <w:r>
               <w:t>/register</w:t>
@@ -127,15 +119,7 @@
               <w:t>R</w:t>
             </w:r>
             <w:r>
-              <w:t xml:space="preserve">egister a new </w:t>
-            </w:r>
-            <w:proofErr w:type="spellStart"/>
-            <w:r>
-              <w:t>raceday</w:t>
-            </w:r>
-            <w:proofErr w:type="spellEnd"/>
-            <w:r>
-              <w:t xml:space="preserve"> user account</w:t>
+              <w:t>egister a new raceday user account</w:t>
             </w:r>
           </w:p>
         </w:tc>
@@ -155,15 +139,7 @@
           </w:tcPr>
           <w:p>
             <w:r>
-              <w:t xml:space="preserve">FirstName, </w:t>
-            </w:r>
-            <w:proofErr w:type="spellStart"/>
-            <w:r>
-              <w:t>lastName,email,phoneNumber</w:t>
-            </w:r>
-            <w:proofErr w:type="spellEnd"/>
-            <w:r>
-              <w:t>, password, role</w:t>
+              <w:t>FirstName, lastName,email,phoneNumber, password, role</w:t>
             </w:r>
           </w:p>
         </w:tc>
@@ -204,15 +180,7 @@
           </w:tcPr>
           <w:p>
             <w:r>
-              <w:t>/</w:t>
-            </w:r>
-            <w:proofErr w:type="spellStart"/>
-            <w:r>
-              <w:t>api</w:t>
-            </w:r>
-            <w:proofErr w:type="spellEnd"/>
-            <w:r>
-              <w:t>/auth/login</w:t>
+              <w:t>/api/auth/login</w:t>
             </w:r>
           </w:p>
         </w:tc>
@@ -385,21 +353,8 @@
           </w:tcPr>
           <w:p>
             <w:r>
-              <w:t>/</w:t>
-            </w:r>
-            <w:proofErr w:type="spellStart"/>
-            <w:r>
-              <w:t>api</w:t>
-            </w:r>
-            <w:proofErr w:type="spellEnd"/>
-            <w:r>
-              <w:t>/</w:t>
-            </w:r>
-            <w:proofErr w:type="spellStart"/>
-            <w:r>
-              <w:t>usersprofile</w:t>
-            </w:r>
-            <w:proofErr w:type="spellEnd"/>
+              <w:t>/api/usersprofile</w:t>
+            </w:r>
           </w:p>
         </w:tc>
         <w:tc>
@@ -495,14 +450,12 @@
             <w:tcW w:w="3265" w:type="dxa"/>
           </w:tcPr>
           <w:p>
-            <w:proofErr w:type="spellStart"/>
             <w:r>
               <w:t>FirstName,LastName,phoneNumber</w:t>
             </w:r>
             <w:r>
               <w:t>,profilePictureRL</w:t>
             </w:r>
-            <w:proofErr w:type="spellEnd"/>
           </w:p>
         </w:tc>
         <w:tc>
@@ -626,15 +579,7 @@
           </w:tcPr>
           <w:p>
             <w:r>
-              <w:t>/</w:t>
-            </w:r>
-            <w:proofErr w:type="spellStart"/>
-            <w:r>
-              <w:t>api</w:t>
-            </w:r>
-            <w:proofErr w:type="spellEnd"/>
-            <w:r>
-              <w:t>/</w:t>
+              <w:t>/api/</w:t>
             </w:r>
             <w:r>
               <w:t>events</w:t>
@@ -647,15 +592,7 @@
           </w:tcPr>
           <w:p>
             <w:r>
-              <w:t xml:space="preserve">will return all the available </w:t>
-            </w:r>
-            <w:proofErr w:type="spellStart"/>
-            <w:r>
-              <w:t>RaceDay</w:t>
-            </w:r>
-            <w:proofErr w:type="spellEnd"/>
-            <w:r>
-              <w:t xml:space="preserve"> Events</w:t>
+              <w:t>will return all the available RaceDay Events</w:t>
             </w:r>
           </w:p>
         </w:tc>
@@ -707,15 +644,7 @@
           </w:tcPr>
           <w:p>
             <w:r>
-              <w:t>/</w:t>
-            </w:r>
-            <w:proofErr w:type="spellStart"/>
-            <w:r>
-              <w:t>api</w:t>
-            </w:r>
-            <w:proofErr w:type="spellEnd"/>
-            <w:r>
-              <w:t>/event</w:t>
+              <w:t>/api/event</w:t>
             </w:r>
             <w:r>
               <w:t>s</w:t>
@@ -786,15 +715,7 @@
           </w:tcPr>
           <w:p>
             <w:r>
-              <w:t>/</w:t>
-            </w:r>
-            <w:proofErr w:type="spellStart"/>
-            <w:r>
-              <w:t>api</w:t>
-            </w:r>
-            <w:proofErr w:type="spellEnd"/>
-            <w:r>
-              <w:t>/events</w:t>
+              <w:t>/api/events</w:t>
             </w:r>
           </w:p>
         </w:tc>
@@ -807,15 +728,7 @@
               <w:t>Create a</w:t>
             </w:r>
             <w:r>
-              <w:t xml:space="preserve"> new </w:t>
-            </w:r>
-            <w:proofErr w:type="spellStart"/>
-            <w:r>
-              <w:t>RaceDay</w:t>
-            </w:r>
-            <w:proofErr w:type="spellEnd"/>
-            <w:r>
-              <w:t xml:space="preserve"> event</w:t>
+              <w:t xml:space="preserve"> new RaceDay event</w:t>
             </w:r>
           </w:p>
         </w:tc>
@@ -835,42 +748,10 @@
           </w:tcPr>
           <w:p>
             <w:r>
-              <w:t>{</w:t>
-            </w:r>
-            <w:proofErr w:type="spellStart"/>
-            <w:r>
-              <w:t>eventName</w:t>
-            </w:r>
-            <w:proofErr w:type="spellEnd"/>
-            <w:r>
-              <w:t xml:space="preserve">, </w:t>
-            </w:r>
-            <w:proofErr w:type="spellStart"/>
-            <w:r>
-              <w:t>description.eventDate</w:t>
-            </w:r>
-            <w:proofErr w:type="spellEnd"/>
-            <w:r>
-              <w:t>, location, distance</w:t>
-            </w:r>
-            <w:r>
-              <w:t xml:space="preserve">, </w:t>
-            </w:r>
-            <w:proofErr w:type="spellStart"/>
-            <w:r>
-              <w:t>eventTypeID</w:t>
-            </w:r>
-            <w:proofErr w:type="spellEnd"/>
-            <w:r>
-              <w:t xml:space="preserve">, </w:t>
-            </w:r>
-            <w:proofErr w:type="spellStart"/>
-            <w:r>
-              <w:t>bannerImageURL</w:t>
-            </w:r>
-            <w:proofErr w:type="spellEnd"/>
-            <w:r>
-              <w:t>}</w:t>
+              <w:t>{eventName, description.eventDate, location, distance</w:t>
+            </w:r>
+            <w:r>
+              <w:t>, eventTypeID, bannerImageURL}</w:t>
             </w:r>
           </w:p>
         </w:tc>
@@ -905,15 +786,7 @@
           </w:tcPr>
           <w:p>
             <w:r>
-              <w:t>/</w:t>
-            </w:r>
-            <w:proofErr w:type="spellStart"/>
-            <w:r>
-              <w:t>api</w:t>
-            </w:r>
-            <w:proofErr w:type="spellEnd"/>
-            <w:r>
-              <w:t>/events/{id}</w:t>
+              <w:t>/api/events/{id}</w:t>
             </w:r>
           </w:p>
         </w:tc>
@@ -923,15 +796,7 @@
           </w:tcPr>
           <w:p>
             <w:r>
-              <w:t xml:space="preserve">Updates an existing </w:t>
-            </w:r>
-            <w:proofErr w:type="spellStart"/>
-            <w:r>
-              <w:t>RaceDay</w:t>
-            </w:r>
-            <w:proofErr w:type="spellEnd"/>
-            <w:r>
-              <w:t xml:space="preserve"> event</w:t>
+              <w:t>Updates an existing RaceDay event</w:t>
             </w:r>
           </w:p>
         </w:tc>
@@ -953,37 +818,8 @@
             <w:r>
               <w:t xml:space="preserve">{ </w:t>
             </w:r>
-            <w:proofErr w:type="spellStart"/>
-            <w:r>
-              <w:t>eventName</w:t>
-            </w:r>
-            <w:proofErr w:type="spellEnd"/>
-            <w:r>
-              <w:t xml:space="preserve">, </w:t>
-            </w:r>
-            <w:proofErr w:type="spellStart"/>
-            <w:r>
-              <w:t>description.eventDate</w:t>
-            </w:r>
-            <w:proofErr w:type="spellEnd"/>
-            <w:r>
-              <w:t xml:space="preserve">, location, distance, </w:t>
-            </w:r>
-            <w:proofErr w:type="spellStart"/>
-            <w:r>
-              <w:t>eventTypeID</w:t>
-            </w:r>
-            <w:proofErr w:type="spellEnd"/>
-            <w:r>
-              <w:t xml:space="preserve">, </w:t>
-            </w:r>
-            <w:proofErr w:type="spellStart"/>
-            <w:r>
-              <w:t>bannerImageURL</w:t>
-            </w:r>
-            <w:proofErr w:type="spellEnd"/>
-            <w:r>
-              <w:t>}</w:t>
+            <w:r>
+              <w:t>eventName, description.eventDate, location, distance, eventTypeID, bannerImageURL}</w:t>
             </w:r>
           </w:p>
         </w:tc>
@@ -1035,24 +871,19 @@
             <w:r>
               <w:t>/</w:t>
             </w:r>
-            <w:proofErr w:type="spellStart"/>
             <w:r>
               <w:t>a</w:t>
             </w:r>
             <w:r>
-              <w:t>pi</w:t>
-            </w:r>
-            <w:proofErr w:type="spellEnd"/>
+              <w:t>pi/</w:t>
+            </w:r>
+            <w:r>
+              <w:t>events</w:t>
+            </w:r>
             <w:r>
               <w:t>/</w:t>
             </w:r>
             <w:r>
-              <w:t>events</w:t>
-            </w:r>
-            <w:r>
-              <w:t>/</w:t>
-            </w:r>
-            <w:r>
               <w:t>{id}</w:t>
             </w:r>
           </w:p>
@@ -1063,15 +894,7 @@
           </w:tcPr>
           <w:p>
             <w:r>
-              <w:t xml:space="preserve">Deletes an existing </w:t>
-            </w:r>
-            <w:proofErr w:type="spellStart"/>
-            <w:r>
-              <w:t>RaceDay</w:t>
-            </w:r>
-            <w:proofErr w:type="spellEnd"/>
-            <w:r>
-              <w:t xml:space="preserve"> event</w:t>
+              <w:t>Deletes an existing RaceDay event</w:t>
             </w:r>
           </w:p>
         </w:tc>
@@ -1221,15 +1044,7 @@
           </w:tcPr>
           <w:p>
             <w:r>
-              <w:t>/</w:t>
-            </w:r>
-            <w:proofErr w:type="spellStart"/>
-            <w:r>
-              <w:t>api</w:t>
-            </w:r>
-            <w:proofErr w:type="spellEnd"/>
-            <w:r>
-              <w:t>/</w:t>
+              <w:t>/api/</w:t>
             </w:r>
             <w:r>
               <w:t>categories</w:t>
@@ -1242,15 +1057,7 @@
           </w:tcPr>
           <w:p>
             <w:r>
-              <w:t xml:space="preserve">Returns all categories available for </w:t>
-            </w:r>
-            <w:proofErr w:type="spellStart"/>
-            <w:r>
-              <w:t>RaceDay</w:t>
-            </w:r>
-            <w:proofErr w:type="spellEnd"/>
-            <w:r>
-              <w:t xml:space="preserve"> events.</w:t>
+              <w:t>Returns all categories available for RaceDay events.</w:t>
             </w:r>
           </w:p>
         </w:tc>
@@ -1302,15 +1109,7 @@
           </w:tcPr>
           <w:p>
             <w:r>
-              <w:t>/</w:t>
-            </w:r>
-            <w:proofErr w:type="spellStart"/>
-            <w:r>
-              <w:t>api</w:t>
-            </w:r>
-            <w:proofErr w:type="spellEnd"/>
-            <w:r>
-              <w:t>/</w:t>
+              <w:t>/api/</w:t>
             </w:r>
             <w:r>
               <w:t>categories</w:t>
@@ -1378,15 +1177,7 @@
           </w:tcPr>
           <w:p>
             <w:r>
-              <w:t>/</w:t>
-            </w:r>
-            <w:proofErr w:type="spellStart"/>
-            <w:r>
-              <w:t>api</w:t>
-            </w:r>
-            <w:proofErr w:type="spellEnd"/>
-            <w:r>
-              <w:t>/</w:t>
+              <w:t>/api/</w:t>
             </w:r>
             <w:r>
               <w:t>categories</w:t>
@@ -1405,15 +1196,7 @@
               <w:t>s a new category</w:t>
             </w:r>
             <w:r>
-              <w:t xml:space="preserve"> for </w:t>
-            </w:r>
-            <w:proofErr w:type="spellStart"/>
-            <w:r>
-              <w:t>RaceDay</w:t>
-            </w:r>
-            <w:proofErr w:type="spellEnd"/>
-            <w:r>
-              <w:t xml:space="preserve"> event.</w:t>
+              <w:t xml:space="preserve"> for RaceDay event.</w:t>
             </w:r>
           </w:p>
         </w:tc>
@@ -1436,47 +1219,13 @@
               <w:t>{</w:t>
             </w:r>
             <w:r>
-              <w:t xml:space="preserve">eventide, </w:t>
-            </w:r>
-            <w:proofErr w:type="spellStart"/>
-            <w:r>
-              <w:t>categoryName</w:t>
-            </w:r>
-            <w:proofErr w:type="spellEnd"/>
-            <w:r>
-              <w:t xml:space="preserve">, </w:t>
-            </w:r>
-            <w:proofErr w:type="spellStart"/>
-            <w:r>
-              <w:t>categoryType</w:t>
-            </w:r>
-            <w:proofErr w:type="spellEnd"/>
-            <w:r>
-              <w:t xml:space="preserve">, </w:t>
-            </w:r>
-            <w:proofErr w:type="spellStart"/>
-            <w:r>
-              <w:t>minimumAge</w:t>
-            </w:r>
-            <w:proofErr w:type="spellEnd"/>
-            <w:r>
-              <w:t xml:space="preserve">, </w:t>
-            </w:r>
-            <w:proofErr w:type="spellStart"/>
-            <w:r>
-              <w:t>maximumAge</w:t>
-            </w:r>
-            <w:proofErr w:type="spellEnd"/>
-            <w:r>
-              <w:t xml:space="preserve">, </w:t>
-            </w:r>
-            <w:proofErr w:type="spellStart"/>
-            <w:r>
-              <w:t>categoryDistance</w:t>
-            </w:r>
-            <w:proofErr w:type="spellEnd"/>
-            <w:r>
-              <w:t>}</w:t>
+              <w:t>event</w:t>
+            </w:r>
+            <w:r>
+              <w:t>ID</w:t>
+            </w:r>
+            <w:r>
+              <w:t>, categoryName, categoryType, minimumAge, maximumAge, categoryDistance}</w:t>
             </w:r>
           </w:p>
         </w:tc>
@@ -1508,15 +1257,7 @@
           </w:tcPr>
           <w:p>
             <w:r>
-              <w:t>/</w:t>
-            </w:r>
-            <w:proofErr w:type="spellStart"/>
-            <w:r>
-              <w:t>api</w:t>
-            </w:r>
-            <w:proofErr w:type="spellEnd"/>
-            <w:r>
-              <w:t>/</w:t>
+              <w:t>/api/</w:t>
             </w:r>
             <w:r>
               <w:t>categories</w:t>
@@ -1555,47 +1296,13 @@
           </w:tcPr>
           <w:p>
             <w:r>
-              <w:t xml:space="preserve">{eventide, </w:t>
-            </w:r>
-            <w:proofErr w:type="spellStart"/>
-            <w:r>
-              <w:t>categoryName</w:t>
-            </w:r>
-            <w:proofErr w:type="spellEnd"/>
-            <w:r>
-              <w:t xml:space="preserve">, </w:t>
-            </w:r>
-            <w:proofErr w:type="spellStart"/>
-            <w:r>
-              <w:t>categoryType</w:t>
-            </w:r>
-            <w:proofErr w:type="spellEnd"/>
-            <w:r>
-              <w:t xml:space="preserve">, </w:t>
-            </w:r>
-            <w:proofErr w:type="spellStart"/>
-            <w:r>
-              <w:t>minimumAge</w:t>
-            </w:r>
-            <w:proofErr w:type="spellEnd"/>
-            <w:r>
-              <w:t xml:space="preserve">, </w:t>
-            </w:r>
-            <w:proofErr w:type="spellStart"/>
-            <w:r>
-              <w:t>maximumAge</w:t>
-            </w:r>
-            <w:proofErr w:type="spellEnd"/>
-            <w:r>
-              <w:t xml:space="preserve">, </w:t>
-            </w:r>
-            <w:proofErr w:type="spellStart"/>
-            <w:r>
-              <w:t>categoryDistance</w:t>
-            </w:r>
-            <w:proofErr w:type="spellEnd"/>
-            <w:r>
-              <w:t>}</w:t>
+              <w:t>{event</w:t>
+            </w:r>
+            <w:r>
+              <w:t>ID</w:t>
+            </w:r>
+            <w:r>
+              <w:t>, categoryName, categoryType, minimumAge, maximumAge, categoryDistance}</w:t>
             </w:r>
           </w:p>
         </w:tc>

</xml_diff>

<commit_message>
fix some spelling errors in step 5
</commit_message>
<xml_diff>
--- a/docs/API Endpoint plan.docx
+++ b/docs/API Endpoint plan.docx
@@ -1558,7 +1558,7 @@
               <w:t>200 OK,40</w:t>
             </w:r>
             <w:r>
-              <w:t>1 Not Un</w:t>
+              <w:t>1 Un</w:t>
             </w:r>
             <w:r>
               <w:t>authorized,404 Not Found</w:t>
@@ -1696,7 +1696,7 @@
           </w:tcPr>
           <w:p>
             <w:r>
-              <w:t>nONE</w:t>
+              <w:t>None</w:t>
             </w:r>
           </w:p>
         </w:tc>

</xml_diff>